<commit_message>
Complete assignment documentation and API abstraction
</commit_message>
<xml_diff>
--- a/docs/Task_1_Test_Strategy_OMS.docx
+++ b/docs/Task_1_Test_Strategy_OMS.docx
@@ -4,15 +4,10 @@
   <w:body>
     <w:p>
       <w:pPr>
+        <w:pStyle w:val="Title"/>
         <w:jc w:val="center"/>
       </w:pPr>
       <w:r>
-        <w:rPr>
-          <w:rFonts w:ascii="Aptos Display" w:hAnsi="Aptos Display"/>
-          <w:b/>
-          <w:color w:val="1F4E79"/>
-          <w:sz w:val="38"/>
-        </w:rPr>
         <w:t>TEST STRATEGY</w:t>
       </w:r>
     </w:p>
@@ -23,10 +18,9 @@
       <w:r>
         <w:rPr>
           <w:i/>
-          <w:color w:val="5A5A5A"/>
           <w:sz w:val="18"/>
         </w:rPr>
-        <w:t>Order Management System (OMS) | QA Automation Take-Home Assessment</w:t>
+        <w:t>Order Management System (OMS) | QA Automation Assessment</w:t>
       </w:r>
     </w:p>
     <w:p>
@@ -34,12 +28,12 @@
         <w:pStyle w:val="Heading1"/>
       </w:pPr>
       <w:r>
-        <w:t>1. Objective and Test Scope</w:t>
+        <w:t>1. Objective and Scope</w:t>
       </w:r>
     </w:p>
     <w:p>
       <w:r>
-        <w:t>Validate the simplified OMS workflow: User Login → Create Order → Process Payment → Order Confirmation. The implementation will use Python, Playwright API testing, pytest, and a local mock OMS service. SQLite will provide persisted records for database-consistency checks. The goal is to verify functional behavior, error handling, response correctness, and consistency of order and payment data.</w:t>
+        <w:t>Validate the workflow Login → Create Order → Process Payment → Order Confirmation using a local mock OMS, Python, Playwright APIRequestContext, pytest, and SQLite. Focus on functional behavior, error handling, response correctness, and persistence consistency.</w:t>
       </w:r>
     </w:p>
     <w:p>
@@ -55,7 +49,7 @@
         <w:pStyle w:val="ListBullet"/>
       </w:pPr>
       <w:r>
-        <w:t>Authentication: valid credentials succeed; invalid credentials are rejected.</w:t>
+        <w:t>Authentication: valid credentials succeed and invalid credentials are rejected.</w:t>
       </w:r>
     </w:p>
     <w:p>
@@ -63,7 +57,7 @@
         <w:pStyle w:val="ListBullet"/>
       </w:pPr>
       <w:r>
-        <w:t>Order creation: required fields, product, quantity, unit price, total amount, and generated order ID.</w:t>
+        <w:t>Order creation: required fields, generated order ID, product details, quantity, unit price, and total.</w:t>
       </w:r>
     </w:p>
     <w:p>
@@ -71,7 +65,7 @@
         <w:pStyle w:val="ListBullet"/>
       </w:pPr>
       <w:r>
-        <w:t>Payment processing: successful and failed payment outcomes, with appropriate order-state transitions.</w:t>
+        <w:t>Payment: successful and failed outcomes produce the expected order and payment states.</w:t>
       </w:r>
     </w:p>
     <w:p>
@@ -79,7 +73,7 @@
         <w:pStyle w:val="ListBullet"/>
       </w:pPr>
       <w:r>
-        <w:t>API contract: HTTP status codes, response structure, required fields, data types, and error messages.</w:t>
+        <w:t>API contract: status codes, response fields, data types, and error responses.</w:t>
       </w:r>
     </w:p>
     <w:p>
@@ -87,7 +81,7 @@
         <w:pStyle w:val="ListBullet"/>
       </w:pPr>
       <w:r>
-        <w:t>Persistence: compare API results with SQLite order and payment records.</w:t>
+        <w:t>Persistence: compare API responses with SQLite order and payment records; check duplicate payment protection.</w:t>
       </w:r>
     </w:p>
     <w:p>
@@ -95,7 +89,7 @@
         <w:pStyle w:val="ListBullet"/>
       </w:pPr>
       <w:r>
-        <w:t>Repeatable execution: isolated test data, reusable helpers, and clear assertions through pytest.</w:t>
+        <w:t>Repeatability: isolated temporary test data, reusable API client, and clear pytest assertions.</w:t>
       </w:r>
     </w:p>
     <w:p>
@@ -108,7 +102,7 @@
     </w:p>
     <w:p>
       <w:r>
-        <w:t>Real payment-provider integration, production load testing, real customer data, and validation of an existing third-party OMS are out of scope because the assignment provides no production application or API contract.</w:t>
+        <w:t>Real payment-provider integration, production load testing, real customer data, and testing an existing third-party OMS are out of scope because no production application or API contract was provided.</w:t>
       </w:r>
     </w:p>
     <w:p>
@@ -119,269 +113,46 @@
         <w:t>2. Key Risks and Mitigations</w:t>
       </w:r>
     </w:p>
-    <w:tbl>
-      <w:tblPr>
-        <w:tblStyle w:val="LightShading-Accent1"/>
-        <w:tblW w:type="auto" w:w="0"/>
-        <w:tblLook w:firstColumn="1" w:firstRow="1" w:lastColumn="0" w:lastRow="0" w:noHBand="0" w:noVBand="1" w:val="04A0"/>
-      </w:tblPr>
-      <w:tblGrid>
-        <w:gridCol w:w="5083"/>
-        <w:gridCol w:w="5083"/>
-      </w:tblGrid>
-      <w:tr>
-        <w:tc>
-          <w:tcPr>
-            <w:tcW w:type="dxa" w:w="5083"/>
-          </w:tcPr>
-          <w:p>
-            <w:pPr>
-              <w:spacing w:after="20"/>
-            </w:pPr>
-            <w:r>
-              <w:rPr>
-                <w:rFonts w:ascii="Aptos" w:hAnsi="Aptos"/>
-                <w:sz w:val="17"/>
-              </w:rPr>
-              <w:t>Risk</w:t>
-            </w:r>
-          </w:p>
-        </w:tc>
-        <w:tc>
-          <w:tcPr>
-            <w:tcW w:type="dxa" w:w="5083"/>
-          </w:tcPr>
-          <w:p>
-            <w:pPr>
-              <w:spacing w:after="20"/>
-            </w:pPr>
-            <w:r>
-              <w:rPr>
-                <w:rFonts w:ascii="Aptos" w:hAnsi="Aptos"/>
-                <w:sz w:val="17"/>
-              </w:rPr>
-              <w:t>Mitigation / validation</w:t>
-            </w:r>
-          </w:p>
-        </w:tc>
-      </w:tr>
-      <w:tr>
-        <w:tc>
-          <w:tcPr>
-            <w:tcW w:type="dxa" w:w="5083"/>
-          </w:tcPr>
-          <w:p>
-            <w:pPr>
-              <w:spacing w:after="20"/>
-            </w:pPr>
-            <w:r>
-              <w:rPr>
-                <w:rFonts w:ascii="Aptos" w:hAnsi="Aptos"/>
-                <w:sz w:val="17"/>
-              </w:rPr>
-              <w:t>Invalid or incomplete authentication</w:t>
-            </w:r>
-          </w:p>
-        </w:tc>
-        <w:tc>
-          <w:tcPr>
-            <w:tcW w:type="dxa" w:w="5083"/>
-          </w:tcPr>
-          <w:p>
-            <w:pPr>
-              <w:spacing w:after="20"/>
-            </w:pPr>
-            <w:r>
-              <w:rPr>
-                <w:rFonts w:ascii="Aptos" w:hAnsi="Aptos"/>
-                <w:sz w:val="17"/>
-              </w:rPr>
-              <w:t>Test missing, incorrect, and malformed credentials; verify protected operations reject unauthenticated requests.</w:t>
-            </w:r>
-          </w:p>
-        </w:tc>
-      </w:tr>
-      <w:tr>
-        <w:tc>
-          <w:tcPr>
-            <w:tcW w:type="dxa" w:w="5083"/>
-          </w:tcPr>
-          <w:p>
-            <w:pPr>
-              <w:spacing w:after="20"/>
-            </w:pPr>
-            <w:r>
-              <w:rPr>
-                <w:rFonts w:ascii="Aptos" w:hAnsi="Aptos"/>
-                <w:sz w:val="17"/>
-              </w:rPr>
-              <w:t>Incorrect order totals or data</w:t>
-            </w:r>
-          </w:p>
-        </w:tc>
-        <w:tc>
-          <w:tcPr>
-            <w:tcW w:type="dxa" w:w="5083"/>
-          </w:tcPr>
-          <w:p>
-            <w:pPr>
-              <w:spacing w:after="20"/>
-            </w:pPr>
-            <w:r>
-              <w:rPr>
-                <w:rFonts w:ascii="Aptos" w:hAnsi="Aptos"/>
-                <w:sz w:val="17"/>
-              </w:rPr>
-              <w:t>Assert quantity and price constraints; calculate expected totals independently and compare with response and database.</w:t>
-            </w:r>
-          </w:p>
-        </w:tc>
-      </w:tr>
-      <w:tr>
-        <w:tc>
-          <w:tcPr>
-            <w:tcW w:type="dxa" w:w="5083"/>
-          </w:tcPr>
-          <w:p>
-            <w:pPr>
-              <w:spacing w:after="20"/>
-            </w:pPr>
-            <w:r>
-              <w:rPr>
-                <w:rFonts w:ascii="Aptos" w:hAnsi="Aptos"/>
-                <w:sz w:val="17"/>
-              </w:rPr>
-              <w:t>Payment failure leaves a confirmed order</w:t>
-            </w:r>
-          </w:p>
-        </w:tc>
-        <w:tc>
-          <w:tcPr>
-            <w:tcW w:type="dxa" w:w="5083"/>
-          </w:tcPr>
-          <w:p>
-            <w:pPr>
-              <w:spacing w:after="20"/>
-            </w:pPr>
-            <w:r>
-              <w:rPr>
-                <w:rFonts w:ascii="Aptos" w:hAnsi="Aptos"/>
-                <w:sz w:val="17"/>
-              </w:rPr>
-              <w:t>Assert failed payments do not transition the order to confirmed; check both API response and persisted state.</w:t>
-            </w:r>
-          </w:p>
-        </w:tc>
-      </w:tr>
-      <w:tr>
-        <w:tc>
-          <w:tcPr>
-            <w:tcW w:type="dxa" w:w="5083"/>
-          </w:tcPr>
-          <w:p>
-            <w:pPr>
-              <w:spacing w:after="20"/>
-            </w:pPr>
-            <w:r>
-              <w:rPr>
-                <w:rFonts w:ascii="Aptos" w:hAnsi="Aptos"/>
-                <w:sz w:val="17"/>
-              </w:rPr>
-              <w:t>API response and database disagree</w:t>
-            </w:r>
-          </w:p>
-        </w:tc>
-        <w:tc>
-          <w:tcPr>
-            <w:tcW w:type="dxa" w:w="5083"/>
-          </w:tcPr>
-          <w:p>
-            <w:pPr>
-              <w:spacing w:after="20"/>
-            </w:pPr>
-            <w:r>
-              <w:rPr>
-                <w:rFonts w:ascii="Aptos" w:hAnsi="Aptos"/>
-                <w:sz w:val="17"/>
-              </w:rPr>
-              <w:t>Query SQLite after each relevant operation and compare order ID, amount, payment status, and order status.</w:t>
-            </w:r>
-          </w:p>
-        </w:tc>
-      </w:tr>
-      <w:tr>
-        <w:tc>
-          <w:tcPr>
-            <w:tcW w:type="dxa" w:w="5083"/>
-          </w:tcPr>
-          <w:p>
-            <w:pPr>
-              <w:spacing w:after="20"/>
-            </w:pPr>
-            <w:r>
-              <w:rPr>
-                <w:rFonts w:ascii="Aptos" w:hAnsi="Aptos"/>
-                <w:sz w:val="17"/>
-              </w:rPr>
-              <w:t>Tests depend on execution order or shared data</w:t>
-            </w:r>
-          </w:p>
-        </w:tc>
-        <w:tc>
-          <w:tcPr>
-            <w:tcW w:type="dxa" w:w="5083"/>
-          </w:tcPr>
-          <w:p>
-            <w:pPr>
-              <w:spacing w:after="20"/>
-            </w:pPr>
-            <w:r>
-              <w:rPr>
-                <w:rFonts w:ascii="Aptos" w:hAnsi="Aptos"/>
-                <w:sz w:val="17"/>
-              </w:rPr>
-              <w:t>Use isolated fixtures/test data and cleanup; avoid relying on IDs or state created by another test.</w:t>
-            </w:r>
-          </w:p>
-        </w:tc>
-      </w:tr>
-      <w:tr>
-        <w:tc>
-          <w:tcPr>
-            <w:tcW w:type="dxa" w:w="5083"/>
-          </w:tcPr>
-          <w:p>
-            <w:pPr>
-              <w:spacing w:after="20"/>
-            </w:pPr>
-            <w:r>
-              <w:rPr>
-                <w:rFonts w:ascii="Aptos" w:hAnsi="Aptos"/>
-                <w:sz w:val="17"/>
-              </w:rPr>
-              <w:t>Mock service hides real-world limitations</w:t>
-            </w:r>
-          </w:p>
-        </w:tc>
-        <w:tc>
-          <w:tcPr>
-            <w:tcW w:type="dxa" w:w="5083"/>
-          </w:tcPr>
-          <w:p>
-            <w:pPr>
-              <w:spacing w:after="20"/>
-            </w:pPr>
-            <w:r>
-              <w:rPr>
-                <w:rFonts w:ascii="Aptos" w:hAnsi="Aptos"/>
-                <w:sz w:val="17"/>
-              </w:rPr>
-              <w:t>Document assumptions clearly; treat results as validation of the simulated contract, not a real payment gateway.</w:t>
-            </w:r>
-          </w:p>
-        </w:tc>
-      </w:tr>
-    </w:tbl>
+    <w:p>
+      <w:pPr>
+        <w:pStyle w:val="ListBullet"/>
+      </w:pPr>
+      <w:r>
+        <w:t>Unauthorized order changes: verify invalid credentials and missing tokens are rejected.</w:t>
+      </w:r>
+    </w:p>
+    <w:p>
+      <w:pPr>
+        <w:pStyle w:val="ListBullet"/>
+      </w:pPr>
+      <w:r>
+        <w:t>Incorrect totals or malformed order data: validate quantity, price, total, response fields, and types.</w:t>
+      </w:r>
+    </w:p>
+    <w:p>
+      <w:pPr>
+        <w:pStyle w:val="ListBullet"/>
+      </w:pPr>
+      <w:r>
+        <w:t>Payment/order state mismatch: compare API responses with SQLite records for successful and failed payments.</w:t>
+      </w:r>
+    </w:p>
+    <w:p>
+      <w:pPr>
+        <w:pStyle w:val="ListBullet"/>
+      </w:pPr>
+      <w:r>
+        <w:t>Duplicate payment processing: submit a repeated payment request and verify the system prevents a second payment record.</w:t>
+      </w:r>
+    </w:p>
+    <w:p>
+      <w:pPr>
+        <w:pStyle w:val="ListBullet"/>
+      </w:pPr>
+      <w:r>
+        <w:t>Unstable or dependent tests: use a local mock service and a fresh temporary database for each test session.</w:t>
+      </w:r>
+    </w:p>
     <w:p>
       <w:pPr>
         <w:pStyle w:val="Heading1"/>
@@ -392,68 +163,12 @@
     </w:p>
     <w:p>
       <w:r>
-        <w:t>Automated (pytest + Playwright APIRequestContext):</w:t>
-      </w:r>
-    </w:p>
-    <w:p>
-      <w:pPr>
-        <w:pStyle w:val="ListBullet"/>
-      </w:pPr>
-      <w:r>
-        <w:t>Positive end-to-end flow: login, create order, simulate successful payment, and validate confirmation.</w:t>
-      </w:r>
-    </w:p>
-    <w:p>
-      <w:pPr>
-        <w:pStyle w:val="ListBullet"/>
-      </w:pPr>
-      <w:r>
-        <w:t>Negative scenarios: invalid login, payment failure, unauthorized access, and invalid order payloads.</w:t>
-      </w:r>
-    </w:p>
-    <w:p>
-      <w:pPr>
-        <w:pStyle w:val="ListBullet"/>
-      </w:pPr>
-      <w:r>
-        <w:t>Data/API checks: status codes, response schema and fields, totals, order state, and database consistency.</w:t>
-      </w:r>
-    </w:p>
-    <w:p>
-      <w:pPr>
-        <w:pStyle w:val="ListBullet"/>
-      </w:pPr>
-      <w:r>
-        <w:t>Regression checks: run the same deterministic scenarios locally and in GitHub Actions.</w:t>
+        <w:t>Automated (pytest + Playwright APIRequestContext): positive login-to-confirmation flow, invalid login, missing authentication, invalid order payloads, payment success/failure, response assertions, and SQLite consistency checks. Run the same regression suite locally and in GitHub Actions.</w:t>
       </w:r>
     </w:p>
     <w:p>
       <w:r>
-        <w:t>Manual:</w:t>
-      </w:r>
-    </w:p>
-    <w:p>
-      <w:pPr>
-        <w:pStyle w:val="ListBullet"/>
-      </w:pPr>
-      <w:r>
-        <w:t>Review ambiguous business rules and confirm expected order/payment state transitions.</w:t>
-      </w:r>
-    </w:p>
-    <w:p>
-      <w:pPr>
-        <w:pStyle w:val="ListBullet"/>
-      </w:pPr>
-      <w:r>
-        <w:t>Exploratory checks for usability or workflows not represented by the mock API.</w:t>
-      </w:r>
-    </w:p>
-    <w:p>
-      <w:pPr>
-        <w:pStyle w:val="ListBullet"/>
-      </w:pPr>
-      <w:r>
-        <w:t>Review test reports, logs, and failure messages when a test fails.</w:t>
+        <w:t>Manual: review ambiguous business rules and expected state transitions, perform exploratory checks for workflows not represented by the mock API, and inspect logs/reports when failures occur.</w:t>
       </w:r>
     </w:p>
     <w:p>
@@ -469,7 +184,7 @@
         <w:pStyle w:val="ListBullet"/>
       </w:pPr>
       <w:r>
-        <w:t>Empty/missing credentials, incorrect password, and missing/invalid authentication token.</w:t>
+        <w:t>Missing credentials, incorrect password, or missing/invalid authentication token.</w:t>
       </w:r>
     </w:p>
     <w:p>
@@ -477,7 +192,7 @@
         <w:pStyle w:val="ListBullet"/>
       </w:pPr>
       <w:r>
-        <w:t>Missing product or quantity; zero, negative, non-integer, or excessively large quantity.</w:t>
+        <w:t>Missing product fields; zero, negative, non-integer, or excessively large quantity.</w:t>
       </w:r>
     </w:p>
     <w:p>
@@ -485,7 +200,7 @@
         <w:pStyle w:val="ListBullet"/>
       </w:pPr>
       <w:r>
-        <w:t>Zero, negative, malformed, or inconsistent price/total values; use decimal-safe currency handling.</w:t>
+        <w:t>Zero, negative, malformed, or inconsistent price and total values.</w:t>
       </w:r>
     </w:p>
     <w:p>
@@ -493,7 +208,7 @@
         <w:pStyle w:val="ListBullet"/>
       </w:pPr>
       <w:r>
-        <w:t>Payment declined or simulated payment service error; ensure order is not incorrectly confirmed.</w:t>
+        <w:t>Payment declined, invalid payment outcome, unknown order ID, or repeated payment request.</w:t>
       </w:r>
     </w:p>
     <w:p>
@@ -501,23 +216,7 @@
         <w:pStyle w:val="ListBullet"/>
       </w:pPr>
       <w:r>
-        <w:t>Repeated payment request or repeated order submission; check for unintended duplicate records if idempotency is supported.</w:t>
-      </w:r>
-    </w:p>
-    <w:p>
-      <w:pPr>
-        <w:pStyle w:val="ListBullet"/>
-      </w:pPr>
-      <w:r>
-        <w:t>Unknown order ID, malformed request body, and attempts to access another user's order if ownership is implemented.</w:t>
-      </w:r>
-    </w:p>
-    <w:p>
-      <w:pPr>
-        <w:pStyle w:val="ListBullet"/>
-      </w:pPr>
-      <w:r>
-        <w:t>Response fields missing or having incorrect types; persisted values differing from the API response.</w:t>
+        <w:t>Response fields missing or incorrectly typed; SQLite values that differ from API responses.</w:t>
       </w:r>
     </w:p>
     <w:p>
@@ -525,56 +224,35 @@
         <w:pStyle w:val="Heading1"/>
       </w:pPr>
       <w:r>
-        <w:t>5. Test Pyramid Approach</w:t>
+        <w:t>5. Test Pyramid</w:t>
       </w:r>
     </w:p>
     <w:p>
       <w:r>
-        <w:t>Prioritize many fast unit tests, a focused set of API/integration tests, and few end-to-end workflow tests. Unit tests validate business rules such as total calculation and state transitions. API/integration tests validate endpoint behavior and SQLite persistence. End-to-end tests validate the complete login-to-confirmation journey. Because this assignment is API-focused, Playwright API tests are the main automation layer; browser UI tests are not required unless a UI is later provided.</w:t>
+        <w:t>Use many fast unit tests for calculations and state-transition rules, a focused set of API/integration tests for endpoint behavior and SQLite persistence, and a small number of end-to-end workflow tests for login through order confirmation. This assignment is API-focused, so Playwright API tests are the main automation layer; browser UI tests can be added if a UI becomes available.</w:t>
       </w:r>
     </w:p>
     <w:p>
       <w:pPr>
-        <w:spacing w:before="100"/>
+        <w:pStyle w:val="Heading1"/>
       </w:pPr>
       <w:r>
-        <w:rPr>
-          <w:b/>
-        </w:rPr>
-        <w:t xml:space="preserve">Assumptions: </w:t>
+        <w:t>Assumptions</w:t>
       </w:r>
+    </w:p>
+    <w:p>
       <w:r>
-        <w:t>The OMS and payment service are simulated locally. Expected statuses and state transitions will be defined in the mock service and documented in the README. No real payment is initiated.</w:t>
+        <w:t>The OMS and payment service are simulated locally. Payment does not move real money. The mock service defines expected status codes and state transitions. Test credentials are local fixtures and are not intended for production use.</w:t>
       </w:r>
     </w:p>
     <w:sectPr>
-      <w:footerReference w:type="default" r:id="rId9"/>
       <w:pgSz w:w="12240" w:h="15840"/>
-      <w:pgMar w:top="893" w:right="1037" w:bottom="893" w:left="1037" w:header="720" w:footer="720" w:gutter="0"/>
+      <w:pgMar w:top="792" w:right="979" w:bottom="792" w:left="979" w:header="720" w:footer="720" w:gutter="0"/>
       <w:cols w:space="720"/>
       <w:docGrid w:linePitch="360"/>
     </w:sectPr>
   </w:body>
 </w:document>
-</file>
-
-<file path=word/footer1.xml><?xml version="1.0" encoding="utf-8"?>
-<w:ftr xmlns:m="http://schemas.openxmlformats.org/officeDocument/2006/math" xmlns:mc="http://schemas.openxmlformats.org/markup-compatibility/2006" xmlns:mo="http://schemas.microsoft.com/office/mac/office/2008/main" xmlns:mv="urn:schemas-microsoft-com:mac:vml" xmlns:o="urn:schemas-microsoft-com:office:office" xmlns:r="http://schemas.openxmlformats.org/officeDocument/2006/relationships" xmlns:v="urn:schemas-microsoft-com:vml" xmlns:w10="urn:schemas-microsoft-com:office:word" xmlns:w14="http://schemas.microsoft.com/office/word/2010/wordml" xmlns:w="http://schemas.openxmlformats.org/wordprocessingml/2006/main" xmlns:wne="http://schemas.microsoft.com/office/word/2006/wordml" xmlns:wp14="http://schemas.microsoft.com/office/word/2010/wordprocessingDrawing" xmlns:wp="http://schemas.openxmlformats.org/drawingml/2006/wordprocessingDrawing" xmlns:wpc="http://schemas.microsoft.com/office/word/2010/wordprocessingCanvas" xmlns:wpg="http://schemas.microsoft.com/office/word/2010/wordprocessingGroup" xmlns:wpi="http://schemas.microsoft.com/office/word/2010/wordprocessingInk" xmlns:wps="http://schemas.microsoft.com/office/word/2010/wordprocessingShape" mc:Ignorable="w14 wp14">
-  <w:p>
-    <w:pPr>
-      <w:pStyle w:val="Footer"/>
-      <w:jc w:val="center"/>
-    </w:pPr>
-    <w:r>
-      <w:rPr>
-        <w:rFonts w:ascii="Aptos" w:hAnsi="Aptos"/>
-        <w:color w:val="6E6E6E"/>
-        <w:sz w:val="16"/>
-      </w:rPr>
-      <w:t>OMS QA Automation | Task 1 — Test Strategy</w:t>
-    </w:r>
-  </w:p>
-</w:ftr>
 </file>
 
 <file path=word/numbering.xml><?xml version="1.0" encoding="utf-8"?>
@@ -941,11 +619,11 @@
     <w:qFormat/>
     <w:rsid w:val="00FC693F"/>
     <w:pPr>
-      <w:spacing w:after="60" w:line="247" w:lineRule="auto"/>
+      <w:spacing w:after="60"/>
     </w:pPr>
     <w:rPr>
-      <w:rFonts w:ascii="Aptos" w:hAnsi="Aptos"/>
-      <w:sz w:val="19"/>
+      <w:rFonts w:ascii="Arial" w:hAnsi="Arial"/>
+      <w:sz w:val="18"/>
     </w:rPr>
   </w:style>
   <w:style w:type="paragraph" w:styleId="Header">
@@ -1007,7 +685,7 @@
       <w:outlineLvl w:val="0"/>
     </w:pPr>
     <w:rPr>
-      <w:rFonts w:asciiTheme="majorHAnsi" w:eastAsiaTheme="majorEastAsia" w:hAnsiTheme="majorHAnsi" w:cstheme="majorBidi" w:ascii="Aptos" w:hAnsi="Aptos"/>
+      <w:rFonts w:asciiTheme="majorHAnsi" w:eastAsiaTheme="majorEastAsia" w:hAnsiTheme="majorHAnsi" w:cstheme="majorBidi" w:ascii="Arial" w:hAnsi="Arial"/>
       <w:b/>
       <w:bCs/>
       <w:color w:val="1F4E79"/>
@@ -1027,14 +705,14 @@
     <w:pPr>
       <w:keepNext/>
       <w:keepLines/>
-      <w:spacing w:before="140" w:after="60"/>
+      <w:spacing w:before="200" w:after="0"/>
       <w:outlineLvl w:val="1"/>
     </w:pPr>
     <w:rPr>
-      <w:rFonts w:asciiTheme="majorHAnsi" w:eastAsiaTheme="majorEastAsia" w:hAnsiTheme="majorHAnsi" w:cstheme="majorBidi" w:ascii="Aptos" w:hAnsi="Aptos"/>
+      <w:rFonts w:asciiTheme="majorHAnsi" w:eastAsiaTheme="majorEastAsia" w:hAnsiTheme="majorHAnsi" w:cstheme="majorBidi" w:ascii="Arial" w:hAnsi="Arial"/>
       <w:b/>
       <w:bCs/>
-      <w:color w:val="1F4E79"/>
+      <w:color w:val="4F81BD" w:themeColor="accent1"/>
       <w:sz w:val="20"/>
       <w:szCs w:val="26"/>
     </w:rPr>
@@ -1292,16 +970,16 @@
       <w:pBdr>
         <w:bottom w:val="single" w:sz="8" w:space="4" w:color="4F81BD" w:themeColor="accent1"/>
       </w:pBdr>
-      <w:spacing w:after="60" w:line="240" w:lineRule="auto" w:before="0"/>
+      <w:spacing w:after="300" w:line="240" w:lineRule="auto"/>
       <w:contextualSpacing/>
     </w:pPr>
     <w:rPr>
-      <w:rFonts w:asciiTheme="majorHAnsi" w:eastAsiaTheme="majorEastAsia" w:hAnsiTheme="majorHAnsi" w:cstheme="majorBidi" w:ascii="Aptos Display" w:hAnsi="Aptos Display"/>
+      <w:rFonts w:asciiTheme="majorHAnsi" w:eastAsiaTheme="majorEastAsia" w:hAnsiTheme="majorHAnsi" w:cstheme="majorBidi" w:ascii="Arial" w:hAnsi="Arial"/>
       <w:b/>
       <w:color w:val="1F4E79"/>
       <w:spacing w:val="5"/>
       <w:kern w:val="28"/>
-      <w:sz w:val="38"/>
+      <w:sz w:val="36"/>
       <w:szCs w:val="52"/>
     </w:rPr>
   </w:style>

</xml_diff>